<commit_message>
feat: redesign Google Doc builder with provenance, confidence badges, and tighter spacing
- Add data_stamp, methodology, sql, cross_verification fields to Finding dataclass
- Add _add_data_stamp(), _add_methodology_sql_section(), _add_confidence_badge() helpers
- Replace plain-text confidence with colored shaded badge (green A, yellow B, orange C)
- Co-locate methodology & SQL per finding instead of orphaning in Resources section
- Deduplicate SQL in Resources (inline SQL filtered, heading becomes "Additional Queries")
- Remove ~14 unnecessary spacing paragraphs across all section builders
- Add provenance enrichment to narrative parser (loads cross-verification YAML + query log)
- Update test fixture with provenance fields and expanded manual checklist
- Add Setup Notion skill, update agents and provenance_assembler

Co-Authored-By: Claude Opus 4.6 <noreply@anthropic.com>
</commit_message>
<xml_diff>
--- a/tests/fixtures/conversion_test.docx
+++ b/tests/fixtures/conversion_test.docx
@@ -37,31 +37,49 @@
         <w:t>Test Author | 2026-04-03</w:t>
       </w:r>
     </w:p>
-    <w:p>
-      <w:r>
-        <w:rPr>
-          <w:rFonts w:ascii="Calibri" w:hAnsi="Calibri"/>
-          <w:b/>
-          <w:i w:val="0"/>
-          <w:color w:val="222222"/>
-          <w:sz w:val="22"/>
-        </w:rPr>
-        <w:t>Analysis Confidence: B+ (85/100)</w:t>
-      </w:r>
-    </w:p>
+    <w:tbl>
+      <w:tblPr>
+        <w:tblStyle w:val="TableGrid"/>
+        <w:tblW w:type="auto" w:w="0"/>
+        <w:tblLook w:firstColumn="1" w:firstRow="1" w:lastColumn="0" w:lastRow="0" w:noHBand="0" w:noVBand="1" w:val="04A0"/>
+      </w:tblPr>
+      <w:tblGrid>
+        <w:gridCol w:w="8640"/>
+      </w:tblGrid>
+      <w:tr>
+        <w:tc>
+          <w:tcPr>
+            <w:tcW w:type="dxa" w:w="8640"/>
+            <w:shd w:fill="FFF3CD" w:val="clear"/>
+          </w:tcPr>
+          <w:p>
+            <w:r/>
+            <w:r>
+              <w:rPr>
+                <w:rFonts w:ascii="Calibri" w:hAnsi="Calibri"/>
+                <w:b/>
+                <w:i w:val="0"/>
+                <w:color w:val="222222"/>
+                <w:sz w:val="22"/>
+              </w:rPr>
+              <w:t>Analysis Confidence: B+ (85/100)</w:t>
+            </w:r>
+          </w:p>
+        </w:tc>
+      </w:tr>
+    </w:tbl>
     <w:p>
       <w:r>
         <w:rPr>
           <w:rFonts w:ascii="Calibri" w:hAnsi="Calibri"/>
           <w:b w:val="0"/>
           <w:i/>
-          <w:color w:val="222222"/>
-          <w:sz w:val="22"/>
+          <w:color w:val="666666"/>
+          <w:sz w:val="20"/>
         </w:rPr>
         <w:t>Treat as directional — test data only.</w:t>
       </w:r>
     </w:p>
-    <w:p/>
     <w:p/>
     <w:p>
       <w:pPr>
@@ -74,7 +92,6 @@
         <w:t>Context</w:t>
       </w:r>
     </w:p>
-    <w:p/>
     <w:p>
       <w:r>
         <w:rPr>
@@ -87,7 +104,6 @@
         <w:t>This document tests every formatting feature used by gdoc_builder.build_readout(). Upload it to Google Drive with convert_to_google_doc=True and check each feature against the manual test checklist in the script header.</w:t>
       </w:r>
     </w:p>
-    <w:p/>
     <w:p>
       <w:pPr>
         <w:pStyle w:val="Heading2"/>
@@ -99,7 +115,6 @@
         <w:t>Summary</w:t>
       </w:r>
     </w:p>
-    <w:p/>
     <w:p>
       <w:pPr>
         <w:pStyle w:val="Heading3"/>
@@ -111,7 +126,6 @@
         <w:t>Primary Learnings</w:t>
       </w:r>
     </w:p>
-    <w:p/>
     <w:p>
       <w:pPr>
         <w:pStyle w:val="ListNumber"/>
@@ -214,7 +228,6 @@
         </w:r>
       </w:hyperlink>
     </w:p>
-    <w:p/>
     <w:p>
       <w:pPr>
         <w:pStyle w:val="Heading3"/>
@@ -226,7 +239,6 @@
         <w:t>Recommendations</w:t>
       </w:r>
     </w:p>
-    <w:p/>
     <w:p>
       <w:pPr>
         <w:pStyle w:val="ListNumber"/>
@@ -303,7 +315,6 @@
       </w:r>
     </w:p>
     <w:p/>
-    <w:p/>
     <w:p>
       <w:r>
         <w:br w:type="page"/>
@@ -320,7 +331,6 @@
         <w:t>Analysis</w:t>
       </w:r>
     </w:p>
-    <w:p/>
     <w:p>
       <w:pPr>
         <w:pStyle w:val="Heading3"/>
@@ -331,10 +341,40 @@
         </w:rPr>
         <w:t>Finding 1: Bold labels are auto-detected</w:t>
       </w:r>
-      <w:bookmarkStart w:id="1580245" w:name="finding-1"/>
-      <w:bookmarkEnd w:id="1580245"/>
+      <w:bookmarkStart w:id="42784489" w:name="finding-1"/>
+      <w:bookmarkEnd w:id="42784489"/>
     </w:p>
-    <w:p/>
+    <w:tbl>
+      <w:tblPr>
+        <w:tblStyle w:val="TableGrid"/>
+        <w:tblW w:type="auto" w:w="0"/>
+        <w:tblLook w:firstColumn="1" w:firstRow="1" w:lastColumn="0" w:lastRow="0" w:noHBand="0" w:noVBand="1" w:val="04A0"/>
+      </w:tblPr>
+      <w:tblGrid>
+        <w:gridCol w:w="8640"/>
+      </w:tblGrid>
+      <w:tr>
+        <w:tc>
+          <w:tcPr>
+            <w:tcW w:type="dxa" w:w="8640"/>
+            <w:shd w:fill="F2F2F2" w:val="clear"/>
+          </w:tcPr>
+          <w:p>
+            <w:r/>
+            <w:r>
+              <w:rPr>
+                <w:rFonts w:ascii="Calibri" w:hAnsi="Calibri"/>
+                <w:b w:val="0"/>
+                <w:i/>
+                <w:color w:val="666666"/>
+                <w:sz w:val="18"/>
+              </w:rPr>
+              <w:t>[1.2M rows | Jan-Mar 2026 | CHECKOUT_EVENTS | Confidence: B+ (85/100)]</w:t>
+            </w:r>
+          </w:p>
+        </w:tc>
+      </w:tr>
+    </w:tbl>
     <w:p>
       <w:r>
         <w:rPr>
@@ -402,7 +442,6 @@
         <w:t xml:space="preserve"> Another bold label test. If this renders with just the label bold, the detection works.</w:t>
       </w:r>
     </w:p>
-    <w:p/>
     <w:p>
       <w:pPr>
         <w:jc w:val="center"/>
@@ -457,7 +496,6 @@
         <w:t>Figure 1: Mobile Checkout Conversion Rate by Month.</w:t>
       </w:r>
     </w:p>
-    <w:p/>
     <w:p>
       <w:pPr>
         <w:pStyle w:val="Heading4"/>
@@ -503,6 +541,98 @@
         <w:t>This paragraph has no bold label — it should render entirely in regular weight body text.</w:t>
       </w:r>
     </w:p>
+    <w:p>
+      <w:pPr>
+        <w:pStyle w:val="Heading4"/>
+      </w:pPr>
+      <w:r>
+        <w:rPr>
+          <w:color w:val="666666"/>
+        </w:rPr>
+        <w:t>Methodology &amp; SQL</w:t>
+      </w:r>
+    </w:p>
+    <w:p>
+      <w:r>
+        <w:rPr>
+          <w:rFonts w:ascii="Calibri" w:hAnsi="Calibri"/>
+          <w:b w:val="0"/>
+          <w:i/>
+          <w:color w:val="222222"/>
+          <w:sz w:val="20"/>
+        </w:rPr>
+        <w:t>Approach: segmented comparison of mobile vs desktop checkout funnels. Aggregation: COUNT DISTINCT user_id by step and device. Filters: date &gt;= '2026-01-01', status IN ('completed', 'abandoned'). Date handling: monthly granularity, UTC.</w:t>
+      </w:r>
+    </w:p>
+    <w:tbl>
+      <w:tblPr>
+        <w:tblStyle w:val="TableGrid"/>
+        <w:tblW w:type="auto" w:w="0"/>
+        <w:tblLook w:firstColumn="1" w:firstRow="1" w:lastColumn="0" w:lastRow="0" w:noHBand="0" w:noVBand="1" w:val="04A0"/>
+      </w:tblPr>
+      <w:tblGrid>
+        <w:gridCol w:w="8640"/>
+      </w:tblGrid>
+      <w:tr>
+        <w:tc>
+          <w:tcPr>
+            <w:tcW w:type="dxa" w:w="8640"/>
+            <w:shd w:fill="F2F2F2" w:val="clear"/>
+          </w:tcPr>
+          <w:p>
+            <w:r/>
+            <w:r>
+              <w:rPr>
+                <w:rFonts w:ascii="Courier New" w:hAnsi="Courier New"/>
+                <w:b w:val="0"/>
+                <w:i w:val="0"/>
+                <w:color w:val="222222"/>
+                <w:sz w:val="18"/>
+              </w:rPr>
+              <w:t>SELECT</w:t>
+              <w:br/>
+              <w:t xml:space="preserve">  device_type,</w:t>
+              <w:br/>
+              <w:t xml:space="preserve">  step_name,</w:t>
+              <w:br/>
+              <w:t xml:space="preserve">  COUNT(DISTINCT user_id) AS users</w:t>
+              <w:br/>
+              <w:t>FROM checkout_events</w:t>
+              <w:br/>
+              <w:t>WHERE event_date &gt;= '2026-01-01'</w:t>
+              <w:br/>
+              <w:t xml:space="preserve">  AND status IN ('completed', 'abandoned')</w:t>
+              <w:br/>
+              <w:t>GROUP BY device_type, step_name</w:t>
+              <w:br/>
+              <w:t>ORDER BY device_type, step_name</w:t>
+            </w:r>
+          </w:p>
+        </w:tc>
+      </w:tr>
+    </w:tbl>
+    <w:p>
+      <w:r>
+        <w:rPr>
+          <w:rFonts w:ascii="Calibri" w:hAnsi="Calibri"/>
+          <w:b/>
+          <w:i/>
+          <w:color w:val="666666"/>
+          <w:sz w:val="18"/>
+        </w:rPr>
+        <w:t xml:space="preserve">Cross-verification: </w:t>
+      </w:r>
+      <w:r>
+        <w:rPr>
+          <w:rFonts w:ascii="Calibri" w:hAnsi="Calibri"/>
+          <w:b w:val="0"/>
+          <w:i/>
+          <w:color w:val="666666"/>
+          <w:sz w:val="18"/>
+        </w:rPr>
+        <w:t>Type B: Parts-to-whole — PASS (Within 0.30% tolerance)</w:t>
+      </w:r>
+    </w:p>
     <w:p/>
     <w:p>
       <w:pPr>
@@ -514,10 +644,40 @@
         </w:rPr>
         <w:t>Finding 2: Bookmark links connect Summary to Analysis</w:t>
       </w:r>
-      <w:bookmarkStart w:id="48226144" w:name="finding-2"/>
-      <w:bookmarkEnd w:id="48226144"/>
+      <w:bookmarkStart w:id="40521315" w:name="finding-2"/>
+      <w:bookmarkEnd w:id="40521315"/>
     </w:p>
-    <w:p/>
+    <w:tbl>
+      <w:tblPr>
+        <w:tblStyle w:val="TableGrid"/>
+        <w:tblW w:type="auto" w:w="0"/>
+        <w:tblLook w:firstColumn="1" w:firstRow="1" w:lastColumn="0" w:lastRow="0" w:noHBand="0" w:noVBand="1" w:val="04A0"/>
+      </w:tblPr>
+      <w:tblGrid>
+        <w:gridCol w:w="8640"/>
+      </w:tblGrid>
+      <w:tr>
+        <w:tc>
+          <w:tcPr>
+            <w:tcW w:type="dxa" w:w="8640"/>
+            <w:shd w:fill="F2F2F2" w:val="clear"/>
+          </w:tcPr>
+          <w:p>
+            <w:r/>
+            <w:r>
+              <w:rPr>
+                <w:rFonts w:ascii="Calibri" w:hAnsi="Calibri"/>
+                <w:b w:val="0"/>
+                <w:i/>
+                <w:color w:val="666666"/>
+                <w:sz w:val="18"/>
+              </w:rPr>
+              <w:t>[340K rows | Jan-Mar 2026 | FUNNEL_EVENTS | Confidence: B+ (85/100)]</w:t>
+            </w:r>
+          </w:p>
+        </w:tc>
+      </w:tr>
+    </w:tbl>
     <w:p>
       <w:r>
         <w:rPr>
@@ -553,6 +713,51 @@
         <w:t>If you clicked '&gt;&gt; See Finding 2' in the Summary section, you should have landed here. This tests internal bookmark navigation.</w:t>
       </w:r>
     </w:p>
+    <w:p>
+      <w:pPr>
+        <w:pStyle w:val="Heading4"/>
+      </w:pPr>
+      <w:r>
+        <w:rPr>
+          <w:color w:val="666666"/>
+        </w:rPr>
+        <w:t>Methodology &amp; SQL</w:t>
+      </w:r>
+    </w:p>
+    <w:p>
+      <w:r>
+        <w:rPr>
+          <w:rFonts w:ascii="Calibri" w:hAnsi="Calibri"/>
+          <w:b w:val="0"/>
+          <w:i/>
+          <w:color w:val="222222"/>
+          <w:sz w:val="20"/>
+        </w:rPr>
+        <w:t>Approach: bookmark navigation verification. No SQL required.</w:t>
+      </w:r>
+    </w:p>
+    <w:p>
+      <w:r>
+        <w:rPr>
+          <w:rFonts w:ascii="Calibri" w:hAnsi="Calibri"/>
+          <w:b/>
+          <w:i/>
+          <w:color w:val="666666"/>
+          <w:sz w:val="18"/>
+        </w:rPr>
+        <w:t xml:space="preserve">Cross-verification: </w:t>
+      </w:r>
+      <w:r>
+        <w:rPr>
+          <w:rFonts w:ascii="Calibri" w:hAnsi="Calibri"/>
+          <w:b w:val="0"/>
+          <w:i/>
+          <w:color w:val="666666"/>
+          <w:sz w:val="18"/>
+        </w:rPr>
+        <w:t>Type A: Boundary check — PASS (3 checks passed)</w:t>
+      </w:r>
+    </w:p>
     <w:p/>
     <w:p>
       <w:pPr>
@@ -564,10 +769,9 @@
         </w:rPr>
         <w:t>Finding 3: Missing chart shows placeholder</w:t>
       </w:r>
-      <w:bookmarkStart w:id="25103542" w:name="finding-3"/>
-      <w:bookmarkEnd w:id="25103542"/>
+      <w:bookmarkStart w:id="5440364" w:name="finding-3"/>
+      <w:bookmarkEnd w:id="5440364"/>
     </w:p>
-    <w:p/>
     <w:p>
       <w:r>
         <w:rPr>
@@ -616,7 +820,6 @@
       </w:r>
     </w:p>
     <w:p/>
-    <w:p/>
     <w:p>
       <w:pPr>
         <w:pStyle w:val="Heading3"/>
@@ -628,7 +831,6 @@
         <w:t>Synthesis</w:t>
       </w:r>
     </w:p>
-    <w:p/>
     <w:p>
       <w:r>
         <w:rPr>
@@ -653,7 +855,6 @@
         <w:t>This analysis carries B+ confidence (85/100). Treat as directional — test data only.</w:t>
       </w:r>
     </w:p>
-    <w:p/>
     <w:p>
       <w:pPr>
         <w:pStyle w:val="Heading3"/>
@@ -665,7 +866,6 @@
         <w:t>Implications</w:t>
       </w:r>
     </w:p>
-    <w:p/>
     <w:p>
       <w:r>
         <w:rPr>
@@ -678,7 +878,6 @@
         <w:t>Features that do not survive .docx-to-Google-Docs conversion will need alternative approaches (text references instead of hyperlinks, plain code blocks instead of shaded cells, etc.).</w:t>
       </w:r>
     </w:p>
-    <w:p/>
     <w:p>
       <w:r>
         <w:br w:type="page"/>
@@ -695,7 +894,6 @@
         <w:t>Next Steps</w:t>
       </w:r>
     </w:p>
-    <w:p/>
     <w:p>
       <w:pPr>
         <w:pStyle w:val="Heading3"/>
@@ -707,7 +905,6 @@
         <w:t>Recommended Actions</w:t>
       </w:r>
     </w:p>
-    <w:p/>
     <w:p>
       <w:r>
         <w:rPr>
@@ -744,7 +941,6 @@
         <w:t>3. Check each item in the manual test checklist</w:t>
       </w:r>
     </w:p>
-    <w:p/>
     <w:p>
       <w:pPr>
         <w:pStyle w:val="Heading3"/>
@@ -756,7 +952,6 @@
         <w:t>Success Tracking</w:t>
       </w:r>
     </w:p>
-    <w:p/>
     <w:p>
       <w:r>
         <w:rPr>
@@ -805,7 +1000,6 @@
         <w:t>Check-in: After first upload test</w:t>
       </w:r>
     </w:p>
-    <w:p/>
     <w:p>
       <w:pPr>
         <w:pStyle w:val="Heading3"/>
@@ -817,7 +1011,6 @@
         <w:t>Open Questions</w:t>
       </w:r>
     </w:p>
-    <w:p/>
     <w:p>
       <w:r>
         <w:rPr>
@@ -854,7 +1047,6 @@
         <w:t>Do page breaks become section breaks or just spacing?</w:t>
       </w:r>
     </w:p>
-    <w:p/>
     <w:p>
       <w:r>
         <w:br w:type="page"/>
@@ -871,7 +1063,6 @@
         <w:t>Resources</w:t>
       </w:r>
     </w:p>
-    <w:p/>
     <w:p>
       <w:pPr>
         <w:pStyle w:val="Heading3"/>
@@ -880,10 +1071,9 @@
         <w:rPr>
           <w:color w:val="1E293B"/>
         </w:rPr>
-        <w:t>Queries</w:t>
+        <w:t>Additional Queries</w:t>
       </w:r>
     </w:p>
-    <w:p/>
     <w:p>
       <w:pPr>
         <w:pStyle w:val="Heading4"/>
@@ -894,8 +1084,8 @@
         </w:rPr>
         <w:t>Query 1: Sample Funnel Query</w:t>
       </w:r>
-      <w:bookmarkStart w:id="41579106" w:name="query-1"/>
-      <w:bookmarkEnd w:id="41579106"/>
+      <w:bookmarkStart w:id="36745875" w:name="query-1"/>
+      <w:bookmarkEnd w:id="36745875"/>
     </w:p>
     <w:p>
       <w:r>
@@ -921,7 +1111,6 @@
         <w:t>Database: novamart.funnel_events</w:t>
       </w:r>
     </w:p>
-    <w:p/>
     <w:tbl>
       <w:tblPr>
         <w:tblStyle w:val="TableGrid"/>
@@ -977,7 +1166,6 @@
         </w:tc>
       </w:tr>
     </w:tbl>
-    <w:p/>
     <w:p>
       <w:pPr>
         <w:pStyle w:val="Heading3"/>
@@ -989,7 +1177,6 @@
         <w:t>Companion Analyses</w:t>
       </w:r>
     </w:p>
-    <w:p/>
     <w:p>
       <w:pPr>
         <w:pStyle w:val="ListBullet"/>
@@ -1006,7 +1193,6 @@
         <w:t>Mobile UX audit report</w:t>
       </w:r>
     </w:p>
-    <w:p/>
     <w:p>
       <w:pPr>
         <w:pStyle w:val="Heading3"/>
@@ -1018,7 +1204,6 @@
         <w:t>Data Sources</w:t>
       </w:r>
     </w:p>
-    <w:p/>
     <w:p>
       <w:r>
         <w:rPr>
@@ -1031,7 +1216,6 @@
         <w:t>NovaMart production database. Tables: checkout_events, funnel_events. Date range: Jan 1 - Mar 31, 2026. 1.2M sessions, 340K unique users.</w:t>
       </w:r>
     </w:p>
-    <w:p/>
     <w:sectPr>
       <w:pgSz w:w="12240" w:h="15840"/>
       <w:pgMar w:top="1440" w:right="1800" w:bottom="1440" w:left="1800" w:header="720" w:footer="720" w:gutter="0"/>

</xml_diff>